<commit_message>
Error report about Braillant BI20
</commit_message>
<xml_diff>
--- a/Documentation/Various Braille devices/Brug af Braillant BI 20 til læsning af NOTA punktnodefiler.docx
+++ b/Documentation/Various Braille devices/Brug af Braillant BI 20 til læsning af NOTA punktnodefiler.docx
@@ -387,7 +387,11 @@
       </w:pPr>
       <w:r>
         <w:rPr/>
-        <w:t>Hvis en fil allerede er åben kan denne lukkes med mellemrum  med e</w:t>
+        <w:t xml:space="preserve">Hvis en fil allerede er åben kan denne lukkes med mellemrum  med e </w:t>
+      </w:r>
+      <w:r>
+        <w:rPr/>
+        <w:t>(DOT15)</w:t>
       </w:r>
     </w:p>
     <w:p>
@@ -516,6 +520,10 @@
       </w:pPr>
       <w:r>
         <w:rPr/>
+        <w:t xml:space="preserve">(Udtræk og  </w:t>
+      </w:r>
+      <w:r>
+        <w:rPr/>
         <w:t>Indsæt USB memory stick</w:t>
       </w:r>
     </w:p>
@@ -621,6 +629,20 @@
       <w:r>
         <w:rPr/>
       </w:r>
+      <w:r>
+        <w:br w:type="page"/>
+      </w:r>
+    </w:p>
+    <w:p>
+      <w:pPr>
+        <w:pStyle w:val="Normal"/>
+        <w:bidi w:val="0"/>
+        <w:jc w:val="left"/>
+        <w:rPr/>
+      </w:pPr>
+      <w:r>
+        <w:rPr/>
+      </w:r>
     </w:p>
     <w:p>
       <w:pPr>
@@ -714,11 +736,7 @@
       </w:pPr>
       <w:r>
         <w:rPr/>
-        <w:t>XXXXX.</w:t>
-      </w:r>
-      <w:r>
-        <w:rPr/>
-        <w:t>brf</w:t>
+        <w:t>XXXXX.brf</w:t>
       </w:r>
     </w:p>
     <w:p>
@@ -846,6 +864,977 @@
           <w:bCs/>
         </w:rPr>
         <w:t>Denne fil ser ikke ud til at vises korrekt!</w:t>
+      </w:r>
+    </w:p>
+    <w:p>
+      <w:pPr>
+        <w:pStyle w:val="Normal"/>
+        <w:bidi w:val="0"/>
+        <w:jc w:val="left"/>
+        <w:rPr/>
+      </w:pPr>
+      <w:r>
+        <w:rPr/>
+      </w:r>
+    </w:p>
+    <w:p>
+      <w:pPr>
+        <w:pStyle w:val="Normal"/>
+        <w:bidi w:val="0"/>
+        <w:jc w:val="left"/>
+        <w:rPr/>
+      </w:pPr>
+      <w:r>
+        <w:rPr/>
+      </w:r>
+    </w:p>
+    <w:p>
+      <w:pPr>
+        <w:pStyle w:val="Normal"/>
+        <w:bidi w:val="0"/>
+        <w:jc w:val="left"/>
+        <w:rPr>
+          <w:b/>
+          <w:b/>
+          <w:bCs/>
+        </w:rPr>
+      </w:pPr>
+      <w:r>
+        <w:rPr>
+          <w:b/>
+          <w:bCs/>
+        </w:rPr>
+        <w:t>2024.03.19</w:t>
+      </w:r>
+    </w:p>
+    <w:p>
+      <w:pPr>
+        <w:pStyle w:val="Normal"/>
+        <w:bidi w:val="0"/>
+        <w:jc w:val="left"/>
+        <w:rPr/>
+      </w:pPr>
+      <w:r>
+        <w:rPr/>
+      </w:r>
+    </w:p>
+    <w:p>
+      <w:pPr>
+        <w:pStyle w:val="Normal"/>
+        <w:bidi w:val="0"/>
+        <w:jc w:val="left"/>
+        <w:rPr/>
+      </w:pPr>
+      <w:r>
+        <w:rPr/>
+        <w:t>Har nu også overført de originale filer fra NOTA  til USB stick.</w:t>
+      </w:r>
+    </w:p>
+    <w:p>
+      <w:pPr>
+        <w:pStyle w:val="Normal"/>
+        <w:bidi w:val="0"/>
+        <w:jc w:val="left"/>
+        <w:rPr/>
+      </w:pPr>
+      <w:r>
+        <w:rPr/>
+      </w:r>
+    </w:p>
+    <w:p>
+      <w:pPr>
+        <w:pStyle w:val="Normal"/>
+        <w:numPr>
+          <w:ilvl w:val="0"/>
+          <w:numId w:val="2"/>
+        </w:numPr>
+        <w:bidi w:val="0"/>
+        <w:jc w:val="left"/>
+        <w:rPr/>
+      </w:pPr>
+      <w:r>
+        <w:rPr/>
+        <w:t>ascii.brf  filen til .BRF</w:t>
+      </w:r>
+    </w:p>
+    <w:p>
+      <w:pPr>
+        <w:pStyle w:val="Normal"/>
+        <w:numPr>
+          <w:ilvl w:val="0"/>
+          <w:numId w:val="2"/>
+        </w:numPr>
+        <w:bidi w:val="0"/>
+        <w:jc w:val="left"/>
+        <w:rPr/>
+      </w:pPr>
+      <w:r>
+        <w:rPr/>
+        <w:t>octoBraille.txt filen til en ny mappe BRL.TXT</w:t>
+      </w:r>
+    </w:p>
+    <w:p>
+      <w:pPr>
+        <w:pStyle w:val="Normal"/>
+        <w:numPr>
+          <w:ilvl w:val="0"/>
+          <w:numId w:val="2"/>
+        </w:numPr>
+        <w:bidi w:val="0"/>
+        <w:jc w:val="left"/>
+        <w:rPr/>
+      </w:pPr>
+      <w:r>
+        <w:rPr/>
+        <w:t>octoBraille.txt filen til mappen .BRL og derefter renamet fra .txt til .brl</w:t>
+      </w:r>
+    </w:p>
+    <w:p>
+      <w:pPr>
+        <w:pStyle w:val="Normal"/>
+        <w:bidi w:val="0"/>
+        <w:jc w:val="left"/>
+        <w:rPr/>
+      </w:pPr>
+      <w:r>
+        <w:rPr/>
+      </w:r>
+    </w:p>
+    <w:p>
+      <w:pPr>
+        <w:pStyle w:val="Normal"/>
+        <w:bidi w:val="0"/>
+        <w:jc w:val="left"/>
+        <w:rPr/>
+      </w:pPr>
+      <w:r>
+        <w:rPr/>
+        <w:t xml:space="preserve">Gentager ovenstående eksperiment med de 3 filer </w:t>
+      </w:r>
+    </w:p>
+    <w:p>
+      <w:pPr>
+        <w:pStyle w:val="Normal"/>
+        <w:bidi w:val="0"/>
+        <w:jc w:val="left"/>
+        <w:rPr/>
+      </w:pPr>
+      <w:r>
+        <w:rPr/>
+      </w:r>
+    </w:p>
+    <w:p>
+      <w:pPr>
+        <w:pStyle w:val="Normal"/>
+        <w:bidi w:val="0"/>
+        <w:jc w:val="left"/>
+        <w:rPr>
+          <w:b/>
+          <w:b/>
+          <w:bCs/>
+        </w:rPr>
+      </w:pPr>
+      <w:r>
+        <w:rPr>
+          <w:b/>
+          <w:bCs/>
+        </w:rPr>
+        <w:t>Først ascii.brf</w:t>
+      </w:r>
+    </w:p>
+    <w:p>
+      <w:pPr>
+        <w:pStyle w:val="Normal"/>
+        <w:bidi w:val="0"/>
+        <w:jc w:val="left"/>
+        <w:rPr/>
+      </w:pPr>
+      <w:r>
+        <w:rPr/>
+      </w:r>
+    </w:p>
+    <w:p>
+      <w:pPr>
+        <w:pStyle w:val="Normal"/>
+        <w:bidi w:val="0"/>
+        <w:jc w:val="left"/>
+        <w:rPr/>
+      </w:pPr>
+      <w:r>
+        <w:rPr/>
+        <w:t>Teksten vises nogenlunde korrekt med følgende  bemærkninger:</w:t>
+      </w:r>
+    </w:p>
+    <w:p>
+      <w:pPr>
+        <w:pStyle w:val="Normal"/>
+        <w:bidi w:val="0"/>
+        <w:jc w:val="left"/>
+        <w:rPr/>
+      </w:pPr>
+      <w:r>
+        <w:rPr/>
+      </w:r>
+    </w:p>
+    <w:p>
+      <w:pPr>
+        <w:pStyle w:val="Normal"/>
+        <w:bidi w:val="0"/>
+        <w:jc w:val="left"/>
+        <w:rPr/>
+      </w:pPr>
+      <w:r>
+        <w:rPr/>
+        <w:t>De første to blanke linjer vises ikke</w:t>
+      </w:r>
+    </w:p>
+    <w:p>
+      <w:pPr>
+        <w:pStyle w:val="Normal"/>
+        <w:bidi w:val="0"/>
+        <w:jc w:val="left"/>
+        <w:rPr/>
+      </w:pPr>
+      <w:r>
+        <w:rPr/>
+        <w:t>Overskriften ”Koralbog” starter i filen rum 14. Man kunne forvente at de første 6 tegn blev vist, men de gør de ikke, der viser DOT123478 i rum 1 og intet andet. Efter tryk på Right vises ”koralbog” helt venstrestillet.</w:t>
+      </w:r>
+    </w:p>
+    <w:p>
+      <w:pPr>
+        <w:pStyle w:val="Normal"/>
+        <w:bidi w:val="0"/>
+        <w:jc w:val="left"/>
+        <w:rPr/>
+      </w:pPr>
+      <w:r>
+        <w:rPr/>
+      </w:r>
+    </w:p>
+    <w:p>
+      <w:pPr>
+        <w:pStyle w:val="Normal"/>
+        <w:bidi w:val="0"/>
+        <w:jc w:val="left"/>
+        <w:rPr/>
+      </w:pPr>
+      <w:r>
+        <w:rPr/>
+        <w:t xml:space="preserve">De følgende linjer vise ogse tilsyneladende korrekt, men det er ikke helt gennemskueligt, hvordan </w:t>
+      </w:r>
+    </w:p>
+    <w:p>
+      <w:pPr>
+        <w:pStyle w:val="Normal"/>
+        <w:bidi w:val="0"/>
+        <w:jc w:val="left"/>
+        <w:rPr/>
+      </w:pPr>
+      <w:r>
+        <w:rPr/>
+        <w:t>pan (right/left) virker sammen med previous/next</w:t>
+      </w:r>
+    </w:p>
+    <w:p>
+      <w:pPr>
+        <w:pStyle w:val="Normal"/>
+        <w:bidi w:val="0"/>
+        <w:jc w:val="left"/>
+        <w:rPr/>
+      </w:pPr>
+      <w:r>
+        <w:rPr/>
+      </w:r>
+    </w:p>
+    <w:p>
+      <w:pPr>
+        <w:pStyle w:val="Normal"/>
+        <w:bidi w:val="0"/>
+        <w:jc w:val="left"/>
+        <w:rPr/>
+      </w:pPr>
+      <w:r>
+        <w:rPr/>
+        <w:t>Det ser ud som om Pan-knapperne ikke bare virker inden for en linje, men også kan bevirke et scroll. Virkningsmåde er indtil videre uklar og det er derfor svært at navigere rundt.</w:t>
+      </w:r>
+    </w:p>
+    <w:p>
+      <w:pPr>
+        <w:pStyle w:val="Normal"/>
+        <w:bidi w:val="0"/>
+        <w:jc w:val="left"/>
+        <w:rPr/>
+      </w:pPr>
+      <w:r>
+        <w:rPr/>
+      </w:r>
+    </w:p>
+    <w:p>
+      <w:pPr>
+        <w:pStyle w:val="Normal"/>
+        <w:bidi w:val="0"/>
+        <w:jc w:val="left"/>
+        <w:rPr/>
+      </w:pPr>
+      <w:r>
+        <w:rPr/>
+      </w:r>
+      <w:r>
+        <w:br w:type="page"/>
+      </w:r>
+    </w:p>
+    <w:p>
+      <w:pPr>
+        <w:pStyle w:val="Normal"/>
+        <w:bidi w:val="0"/>
+        <w:jc w:val="left"/>
+        <w:rPr/>
+      </w:pPr>
+      <w:r>
+        <w:rPr/>
+      </w:r>
+    </w:p>
+    <w:p>
+      <w:pPr>
+        <w:pStyle w:val="Normal"/>
+        <w:bidi w:val="0"/>
+        <w:jc w:val="left"/>
+        <w:rPr>
+          <w:b/>
+          <w:b/>
+          <w:bCs/>
+        </w:rPr>
+      </w:pPr>
+      <w:r>
+        <w:rPr>
+          <w:b/>
+          <w:bCs/>
+        </w:rPr>
+        <w:t>Dernæst octobraille filen med dens oprindelige endelse .txt</w:t>
+      </w:r>
+    </w:p>
+    <w:p>
+      <w:pPr>
+        <w:pStyle w:val="Normal"/>
+        <w:bidi w:val="0"/>
+        <w:jc w:val="left"/>
+        <w:rPr/>
+      </w:pPr>
+      <w:r>
+        <w:rPr/>
+      </w:r>
+    </w:p>
+    <w:p>
+      <w:pPr>
+        <w:pStyle w:val="Normal"/>
+        <w:bidi w:val="0"/>
+        <w:jc w:val="left"/>
+        <w:rPr/>
+      </w:pPr>
+      <w:r>
+        <w:rPr/>
+        <w:t>Når man forsøger at åbne denne fil vises</w:t>
+      </w:r>
+    </w:p>
+    <w:p>
+      <w:pPr>
+        <w:pStyle w:val="Normal"/>
+        <w:bidi w:val="0"/>
+        <w:jc w:val="left"/>
+        <w:rPr/>
+      </w:pPr>
+      <w:r>
+        <w:rPr/>
+      </w:r>
+    </w:p>
+    <w:p>
+      <w:pPr>
+        <w:pStyle w:val="Normal"/>
+        <w:bidi w:val="0"/>
+        <w:jc w:val="left"/>
+        <w:rPr/>
+      </w:pPr>
+      <w:r>
+        <w:rPr/>
+        <w:t xml:space="preserve">gå (til) ov(er)(or)dn(et) </w:t>
+      </w:r>
+    </w:p>
+    <w:p>
+      <w:pPr>
+        <w:pStyle w:val="Normal"/>
+        <w:bidi w:val="0"/>
+        <w:jc w:val="left"/>
+        <w:rPr/>
+      </w:pPr>
+      <w:r>
+        <w:rPr/>
+      </w:r>
+    </w:p>
+    <w:p>
+      <w:pPr>
+        <w:pStyle w:val="Normal"/>
+        <w:bidi w:val="0"/>
+        <w:jc w:val="left"/>
+        <w:rPr/>
+      </w:pPr>
+      <w:r>
+        <w:rPr/>
+        <w:t>Apparatet vil tilsyneladende ikke kendes ved den oprindelige endelse .txt.</w:t>
+      </w:r>
+    </w:p>
+    <w:p>
+      <w:pPr>
+        <w:pStyle w:val="Normal"/>
+        <w:bidi w:val="0"/>
+        <w:jc w:val="left"/>
+        <w:rPr/>
+      </w:pPr>
+      <w:r>
+        <w:rPr/>
+      </w:r>
+    </w:p>
+    <w:p>
+      <w:pPr>
+        <w:pStyle w:val="Normal"/>
+        <w:bidi w:val="0"/>
+        <w:jc w:val="left"/>
+        <w:rPr/>
+      </w:pPr>
+      <w:r>
+        <w:rPr/>
+        <w:t xml:space="preserve"> </w:t>
+      </w:r>
+    </w:p>
+    <w:p>
+      <w:pPr>
+        <w:pStyle w:val="Normal"/>
+        <w:bidi w:val="0"/>
+        <w:jc w:val="left"/>
+        <w:rPr>
+          <w:b/>
+          <w:b/>
+          <w:bCs/>
+        </w:rPr>
+      </w:pPr>
+      <w:r>
+        <w:rPr>
+          <w:b/>
+          <w:bCs/>
+        </w:rPr>
+        <w:t>Dernæst octobraille filen med endelsen .txt ændret til .brl</w:t>
+      </w:r>
+    </w:p>
+    <w:p>
+      <w:pPr>
+        <w:pStyle w:val="Normal"/>
+        <w:bidi w:val="0"/>
+        <w:jc w:val="left"/>
+        <w:rPr>
+          <w:b/>
+          <w:b/>
+          <w:bCs/>
+        </w:rPr>
+      </w:pPr>
+      <w:r>
+        <w:rPr>
+          <w:b/>
+          <w:bCs/>
+        </w:rPr>
+      </w:r>
+    </w:p>
+    <w:p>
+      <w:pPr>
+        <w:pStyle w:val="Normal"/>
+        <w:bidi w:val="0"/>
+        <w:jc w:val="left"/>
+        <w:rPr>
+          <w:b w:val="false"/>
+          <w:b w:val="false"/>
+          <w:bCs w:val="false"/>
+        </w:rPr>
+      </w:pPr>
+      <w:r>
+        <w:rPr>
+          <w:b w:val="false"/>
+          <w:bCs w:val="false"/>
+        </w:rPr>
+        <w:t>Nu kan filen indlæses og ”koralbog” og ”til den danske salmebog 2003” kan indlæses med samme bemærkninger som under ”.brf”.</w:t>
+      </w:r>
+    </w:p>
+    <w:p>
+      <w:pPr>
+        <w:pStyle w:val="Normal"/>
+        <w:bidi w:val="0"/>
+        <w:jc w:val="left"/>
+        <w:rPr>
+          <w:b w:val="false"/>
+          <w:b w:val="false"/>
+          <w:bCs w:val="false"/>
+        </w:rPr>
+      </w:pPr>
+      <w:r>
+        <w:rPr>
+          <w:b w:val="false"/>
+          <w:bCs w:val="false"/>
+        </w:rPr>
+      </w:r>
+    </w:p>
+    <w:p>
+      <w:pPr>
+        <w:pStyle w:val="Normal"/>
+        <w:bidi w:val="0"/>
+        <w:jc w:val="left"/>
+        <w:rPr>
+          <w:b w:val="false"/>
+          <w:b w:val="false"/>
+          <w:bCs w:val="false"/>
+        </w:rPr>
+      </w:pPr>
+      <w:r>
+        <w:rPr>
+          <w:b w:val="false"/>
+          <w:bCs w:val="false"/>
+        </w:rPr>
+        <w:t>Men i linje 6 er der en forskel: (Nodelæseren indlæser .txt under antagelse af at det er OctoBraille)</w:t>
+      </w:r>
+    </w:p>
+    <w:p>
+      <w:pPr>
+        <w:pStyle w:val="Normal"/>
+        <w:bidi w:val="0"/>
+        <w:jc w:val="left"/>
+        <w:rPr>
+          <w:b w:val="false"/>
+          <w:b w:val="false"/>
+          <w:bCs w:val="false"/>
+        </w:rPr>
+      </w:pPr>
+      <w:r>
+        <w:rPr>
+          <w:b w:val="false"/>
+          <w:bCs w:val="false"/>
+        </w:rPr>
+      </w:r>
+    </w:p>
+    <w:p>
+      <w:pPr>
+        <w:pStyle w:val="Normal"/>
+        <w:bidi w:val="0"/>
+        <w:jc w:val="left"/>
+        <w:rPr>
+          <w:b w:val="false"/>
+          <w:b w:val="false"/>
+          <w:bCs w:val="false"/>
+        </w:rPr>
+      </w:pPr>
+      <w:r>
+        <w:rPr>
+          <w:b w:val="false"/>
+          <w:bCs w:val="false"/>
+        </w:rPr>
+        <w:t>Både IBOS punkrnodelæser or Braillant viser en række tomme rum, efterfulgt af</w:t>
+      </w:r>
+    </w:p>
+    <w:p>
+      <w:pPr>
+        <w:pStyle w:val="Normal"/>
+        <w:bidi w:val="0"/>
+        <w:jc w:val="left"/>
+        <w:rPr>
+          <w:b w:val="false"/>
+          <w:b w:val="false"/>
+          <w:bCs w:val="false"/>
+        </w:rPr>
+      </w:pPr>
+      <w:r>
+        <w:rPr>
+          <w:b w:val="false"/>
+          <w:bCs w:val="false"/>
+        </w:rPr>
+      </w:r>
+    </w:p>
+    <w:p>
+      <w:pPr>
+        <w:pStyle w:val="Normal"/>
+        <w:bidi w:val="0"/>
+        <w:jc w:val="left"/>
+        <w:rPr>
+          <w:b w:val="false"/>
+          <w:b w:val="false"/>
+          <w:bCs w:val="false"/>
+        </w:rPr>
+      </w:pPr>
+      <w:r>
+        <w:rPr>
+          <w:b w:val="false"/>
+          <w:bCs w:val="false"/>
+        </w:rPr>
+        <w:t>12 24 1345 145 (bind)</w:t>
+      </w:r>
+    </w:p>
+    <w:p>
+      <w:pPr>
+        <w:pStyle w:val="Normal"/>
+        <w:bidi w:val="0"/>
+        <w:jc w:val="left"/>
+        <w:rPr>
+          <w:b w:val="false"/>
+          <w:b w:val="false"/>
+          <w:bCs w:val="false"/>
+        </w:rPr>
+      </w:pPr>
+      <w:r>
+        <w:rPr>
+          <w:b w:val="false"/>
+          <w:bCs w:val="false"/>
+        </w:rPr>
+      </w:r>
+    </w:p>
+    <w:p>
+      <w:pPr>
+        <w:pStyle w:val="Normal"/>
+        <w:bidi w:val="0"/>
+        <w:jc w:val="left"/>
+        <w:rPr>
+          <w:b w:val="false"/>
+          <w:b w:val="false"/>
+          <w:bCs w:val="false"/>
+        </w:rPr>
+      </w:pPr>
+      <w:r>
+        <w:rPr>
+          <w:b w:val="false"/>
+          <w:bCs w:val="false"/>
+        </w:rPr>
+        <w:t xml:space="preserve">men derefter viser nodelæseren 0 46 24 mens Braillant viser 0 24 </w:t>
+      </w:r>
+    </w:p>
+    <w:p>
+      <w:pPr>
+        <w:pStyle w:val="Normal"/>
+        <w:bidi w:val="0"/>
+        <w:jc w:val="left"/>
+        <w:rPr>
+          <w:b w:val="false"/>
+          <w:b w:val="false"/>
+          <w:bCs w:val="false"/>
+        </w:rPr>
+      </w:pPr>
+      <w:r>
+        <w:rPr>
+          <w:b w:val="false"/>
+          <w:bCs w:val="false"/>
+        </w:rPr>
+      </w:r>
+    </w:p>
+    <w:p>
+      <w:pPr>
+        <w:pStyle w:val="Normal"/>
+        <w:bidi w:val="0"/>
+        <w:jc w:val="left"/>
+        <w:rPr>
+          <w:b w:val="false"/>
+          <w:b w:val="false"/>
+          <w:bCs w:val="false"/>
+        </w:rPr>
+      </w:pPr>
+      <w:r>
+        <w:rPr>
+          <w:b w:val="false"/>
+          <w:bCs w:val="false"/>
+        </w:rPr>
+        <w:t>Oven i købet rapporterer Nodelæseren ”Ingen fortolkning af DOT46 som den tilsyneladende selv har opfundet!” Det kunne sagtens være Nodelæseren, der er på vildspor her !!</w:t>
+      </w:r>
+    </w:p>
+    <w:p>
+      <w:pPr>
+        <w:pStyle w:val="Normal"/>
+        <w:bidi w:val="0"/>
+        <w:jc w:val="left"/>
+        <w:rPr>
+          <w:b w:val="false"/>
+          <w:b w:val="false"/>
+          <w:bCs w:val="false"/>
+        </w:rPr>
+      </w:pPr>
+      <w:r>
+        <w:rPr>
+          <w:b w:val="false"/>
+          <w:bCs w:val="false"/>
+        </w:rPr>
+      </w:r>
+    </w:p>
+    <w:p>
+      <w:pPr>
+        <w:pStyle w:val="Normal"/>
+        <w:bidi w:val="0"/>
+        <w:jc w:val="left"/>
+        <w:rPr>
+          <w:b w:val="false"/>
+          <w:b w:val="false"/>
+          <w:bCs w:val="false"/>
+        </w:rPr>
+      </w:pPr>
+      <w:r>
+        <w:rPr>
+          <w:b w:val="false"/>
+          <w:bCs w:val="false"/>
+        </w:rPr>
+        <w:t>Den trykte udgave viser ”bind I” altå med stort ”i”.</w:t>
+      </w:r>
+    </w:p>
+    <w:p>
+      <w:pPr>
+        <w:pStyle w:val="Normal"/>
+        <w:bidi w:val="0"/>
+        <w:jc w:val="left"/>
+        <w:rPr>
+          <w:b w:val="false"/>
+          <w:b w:val="false"/>
+          <w:bCs w:val="false"/>
+        </w:rPr>
+      </w:pPr>
+      <w:r>
+        <w:rPr>
+          <w:b w:val="false"/>
+          <w:bCs w:val="false"/>
+        </w:rPr>
+      </w:r>
+    </w:p>
+    <w:p>
+      <w:pPr>
+        <w:pStyle w:val="Normal"/>
+        <w:bidi w:val="0"/>
+        <w:jc w:val="left"/>
+        <w:rPr>
+          <w:b w:val="false"/>
+          <w:b w:val="false"/>
+          <w:bCs w:val="false"/>
+        </w:rPr>
+      </w:pPr>
+      <w:r>
+        <w:rPr>
+          <w:b w:val="false"/>
+          <w:bCs w:val="false"/>
+        </w:rPr>
+        <w:t xml:space="preserve">DOT46 betyder ”Stort bogstav” så det er tydeligvis en fejl at nodelæseren ikke forstår det i tekstsammenhæng , og det er underligt at DOT46 slet ikke vises af Braillant !! </w:t>
+      </w:r>
+    </w:p>
+    <w:p>
+      <w:pPr>
+        <w:pStyle w:val="Normal"/>
+        <w:bidi w:val="0"/>
+        <w:jc w:val="left"/>
+        <w:rPr>
+          <w:b w:val="false"/>
+          <w:b w:val="false"/>
+          <w:bCs w:val="false"/>
+        </w:rPr>
+      </w:pPr>
+      <w:r>
+        <w:rPr>
+          <w:b w:val="false"/>
+          <w:bCs w:val="false"/>
+        </w:rPr>
+      </w:r>
+    </w:p>
+    <w:p>
+      <w:pPr>
+        <w:pStyle w:val="Normal"/>
+        <w:bidi w:val="0"/>
+        <w:jc w:val="left"/>
+        <w:rPr>
+          <w:b w:val="false"/>
+          <w:b w:val="false"/>
+          <w:bCs w:val="false"/>
+        </w:rPr>
+      </w:pPr>
+      <w:r>
+        <w:rPr>
+          <w:b w:val="false"/>
+          <w:bCs w:val="false"/>
+        </w:rPr>
+        <w:t xml:space="preserve">Herefter følger en række tegn, som vises forskelligt af Nodelæser og Braillant, og så bliver de enige igen.  </w:t>
+      </w:r>
+    </w:p>
+    <w:p>
+      <w:pPr>
+        <w:pStyle w:val="Normal"/>
+        <w:bidi w:val="0"/>
+        <w:jc w:val="left"/>
+        <w:rPr>
+          <w:b w:val="false"/>
+          <w:b w:val="false"/>
+          <w:bCs w:val="false"/>
+        </w:rPr>
+      </w:pPr>
+      <w:r>
+        <w:rPr>
+          <w:b w:val="false"/>
+          <w:bCs w:val="false"/>
+        </w:rPr>
+      </w:r>
+    </w:p>
+    <w:p>
+      <w:pPr>
+        <w:pStyle w:val="Normal"/>
+        <w:bidi w:val="0"/>
+        <w:jc w:val="left"/>
+        <w:rPr>
+          <w:b w:val="false"/>
+          <w:b w:val="false"/>
+          <w:bCs w:val="false"/>
+        </w:rPr>
+      </w:pPr>
+      <w:r>
+        <w:rPr>
+          <w:b w:val="false"/>
+          <w:bCs w:val="false"/>
+        </w:rPr>
+        <w:t>Det viser sig at IBOS Punktnodelæser viser samme sekvens heromkring uanset om den indlæser OctrBraille eller ASCII</w:t>
+      </w:r>
+    </w:p>
+    <w:p>
+      <w:pPr>
+        <w:pStyle w:val="Normal"/>
+        <w:bidi w:val="0"/>
+        <w:jc w:val="left"/>
+        <w:rPr>
+          <w:b/>
+          <w:b/>
+          <w:bCs/>
+        </w:rPr>
+      </w:pPr>
+      <w:r>
+        <w:rPr>
+          <w:b/>
+          <w:bCs/>
+        </w:rPr>
+      </w:r>
+    </w:p>
+    <w:p>
+      <w:pPr>
+        <w:pStyle w:val="Normal"/>
+        <w:bidi w:val="0"/>
+        <w:jc w:val="left"/>
+        <w:rPr>
+          <w:b/>
+          <w:b/>
+          <w:bCs/>
+        </w:rPr>
+      </w:pPr>
+      <w:r>
+        <w:rPr>
+          <w:b/>
+          <w:bCs/>
+        </w:rPr>
+      </w:r>
+    </w:p>
+    <w:p>
+      <w:pPr>
+        <w:pStyle w:val="Normal"/>
+        <w:bidi w:val="0"/>
+        <w:jc w:val="left"/>
+        <w:rPr>
+          <w:b/>
+          <w:b/>
+          <w:bCs/>
+        </w:rPr>
+      </w:pPr>
+      <w:r>
+        <w:rPr>
+          <w:b/>
+          <w:bCs/>
+        </w:rPr>
+        <w:t>Man må antage, at Braillant ikke viser all tegn i en OctroBraille på samme måde, som NOTA forventer !</w:t>
+      </w:r>
+    </w:p>
+    <w:p>
+      <w:pPr>
+        <w:pStyle w:val="Normal"/>
+        <w:bidi w:val="0"/>
+        <w:jc w:val="left"/>
+        <w:rPr>
+          <w:b/>
+          <w:b/>
+          <w:bCs/>
+        </w:rPr>
+      </w:pPr>
+      <w:r>
+        <w:rPr>
+          <w:b/>
+          <w:bCs/>
+        </w:rPr>
+      </w:r>
+    </w:p>
+    <w:p>
+      <w:pPr>
+        <w:pStyle w:val="Normal"/>
+        <w:bidi w:val="0"/>
+        <w:jc w:val="left"/>
+        <w:rPr/>
+      </w:pPr>
+      <w:r>
+        <w:rPr/>
+      </w:r>
+    </w:p>
+    <w:p>
+      <w:pPr>
+        <w:pStyle w:val="Normal"/>
+        <w:bidi w:val="0"/>
+        <w:jc w:val="left"/>
+        <w:rPr/>
+      </w:pPr>
+      <w:r>
+        <w:rPr/>
+      </w:r>
+    </w:p>
+    <w:p>
+      <w:pPr>
+        <w:pStyle w:val="Normal"/>
+        <w:bidi w:val="0"/>
+        <w:jc w:val="left"/>
+        <w:rPr/>
+      </w:pPr>
+      <w:r>
+        <w:rPr/>
+      </w:r>
+    </w:p>
+    <w:p>
+      <w:pPr>
+        <w:pStyle w:val="Normal"/>
+        <w:bidi w:val="0"/>
+        <w:jc w:val="left"/>
+        <w:rPr/>
+      </w:pPr>
+      <w:r>
+        <w:rPr/>
+      </w:r>
+      <w:r>
+        <w:br w:type="page"/>
+      </w:r>
+    </w:p>
+    <w:p>
+      <w:pPr>
+        <w:pStyle w:val="Normal"/>
+        <w:bidi w:val="0"/>
+        <w:jc w:val="left"/>
+        <w:rPr>
+          <w:b/>
+          <w:b/>
+          <w:bCs/>
+          <w:sz w:val="40"/>
+          <w:szCs w:val="40"/>
+        </w:rPr>
+      </w:pPr>
+      <w:r>
+        <w:rPr>
+          <w:b/>
+          <w:bCs/>
+          <w:sz w:val="40"/>
+          <w:szCs w:val="40"/>
+        </w:rPr>
+        <w:t>Her følger noget forældet tekst</w:t>
       </w:r>
     </w:p>
     <w:p>
@@ -1649,6 +2638,143 @@
   <w:abstractNum w:abstractNumId="2">
     <w:lvl w:ilvl="0">
       <w:start w:val="1"/>
+      <w:numFmt w:val="bullet"/>
+      <w:lvlText w:val=""/>
+      <w:lvlJc w:val="left"/>
+      <w:pPr>
+        <w:tabs>
+          <w:tab w:val="num" w:pos="720"/>
+        </w:tabs>
+        <w:ind w:left="720" w:hanging="360"/>
+      </w:pPr>
+      <w:rPr>
+        <w:rFonts w:ascii="Symbol" w:hAnsi="Symbol" w:cs="Symbol" w:hint="default"/>
+      </w:rPr>
+    </w:lvl>
+    <w:lvl w:ilvl="1">
+      <w:start w:val="1"/>
+      <w:numFmt w:val="bullet"/>
+      <w:lvlText w:val="◦"/>
+      <w:lvlJc w:val="left"/>
+      <w:pPr>
+        <w:tabs>
+          <w:tab w:val="num" w:pos="1080"/>
+        </w:tabs>
+        <w:ind w:left="1080" w:hanging="360"/>
+      </w:pPr>
+      <w:rPr>
+        <w:rFonts w:ascii="OpenSymbol" w:hAnsi="OpenSymbol" w:cs="OpenSymbol" w:hint="default"/>
+      </w:rPr>
+    </w:lvl>
+    <w:lvl w:ilvl="2">
+      <w:start w:val="1"/>
+      <w:numFmt w:val="bullet"/>
+      <w:lvlText w:val="▪"/>
+      <w:lvlJc w:val="left"/>
+      <w:pPr>
+        <w:tabs>
+          <w:tab w:val="num" w:pos="1440"/>
+        </w:tabs>
+        <w:ind w:left="1440" w:hanging="360"/>
+      </w:pPr>
+      <w:rPr>
+        <w:rFonts w:ascii="OpenSymbol" w:hAnsi="OpenSymbol" w:cs="OpenSymbol" w:hint="default"/>
+      </w:rPr>
+    </w:lvl>
+    <w:lvl w:ilvl="3">
+      <w:start w:val="1"/>
+      <w:numFmt w:val="bullet"/>
+      <w:lvlText w:val=""/>
+      <w:lvlJc w:val="left"/>
+      <w:pPr>
+        <w:tabs>
+          <w:tab w:val="num" w:pos="1800"/>
+        </w:tabs>
+        <w:ind w:left="1800" w:hanging="360"/>
+      </w:pPr>
+      <w:rPr>
+        <w:rFonts w:ascii="Symbol" w:hAnsi="Symbol" w:cs="Symbol" w:hint="default"/>
+      </w:rPr>
+    </w:lvl>
+    <w:lvl w:ilvl="4">
+      <w:start w:val="1"/>
+      <w:numFmt w:val="bullet"/>
+      <w:lvlText w:val="◦"/>
+      <w:lvlJc w:val="left"/>
+      <w:pPr>
+        <w:tabs>
+          <w:tab w:val="num" w:pos="2160"/>
+        </w:tabs>
+        <w:ind w:left="2160" w:hanging="360"/>
+      </w:pPr>
+      <w:rPr>
+        <w:rFonts w:ascii="OpenSymbol" w:hAnsi="OpenSymbol" w:cs="OpenSymbol" w:hint="default"/>
+      </w:rPr>
+    </w:lvl>
+    <w:lvl w:ilvl="5">
+      <w:start w:val="1"/>
+      <w:numFmt w:val="bullet"/>
+      <w:lvlText w:val="▪"/>
+      <w:lvlJc w:val="left"/>
+      <w:pPr>
+        <w:tabs>
+          <w:tab w:val="num" w:pos="2520"/>
+        </w:tabs>
+        <w:ind w:left="2520" w:hanging="360"/>
+      </w:pPr>
+      <w:rPr>
+        <w:rFonts w:ascii="OpenSymbol" w:hAnsi="OpenSymbol" w:cs="OpenSymbol" w:hint="default"/>
+      </w:rPr>
+    </w:lvl>
+    <w:lvl w:ilvl="6">
+      <w:start w:val="1"/>
+      <w:numFmt w:val="bullet"/>
+      <w:lvlText w:val=""/>
+      <w:lvlJc w:val="left"/>
+      <w:pPr>
+        <w:tabs>
+          <w:tab w:val="num" w:pos="2880"/>
+        </w:tabs>
+        <w:ind w:left="2880" w:hanging="360"/>
+      </w:pPr>
+      <w:rPr>
+        <w:rFonts w:ascii="Symbol" w:hAnsi="Symbol" w:cs="Symbol" w:hint="default"/>
+      </w:rPr>
+    </w:lvl>
+    <w:lvl w:ilvl="7">
+      <w:start w:val="1"/>
+      <w:numFmt w:val="bullet"/>
+      <w:lvlText w:val="◦"/>
+      <w:lvlJc w:val="left"/>
+      <w:pPr>
+        <w:tabs>
+          <w:tab w:val="num" w:pos="3240"/>
+        </w:tabs>
+        <w:ind w:left="3240" w:hanging="360"/>
+      </w:pPr>
+      <w:rPr>
+        <w:rFonts w:ascii="OpenSymbol" w:hAnsi="OpenSymbol" w:cs="OpenSymbol" w:hint="default"/>
+      </w:rPr>
+    </w:lvl>
+    <w:lvl w:ilvl="8">
+      <w:start w:val="1"/>
+      <w:numFmt w:val="bullet"/>
+      <w:lvlText w:val="▪"/>
+      <w:lvlJc w:val="left"/>
+      <w:pPr>
+        <w:tabs>
+          <w:tab w:val="num" w:pos="3600"/>
+        </w:tabs>
+        <w:ind w:left="3600" w:hanging="360"/>
+      </w:pPr>
+      <w:rPr>
+        <w:rFonts w:ascii="OpenSymbol" w:hAnsi="OpenSymbol" w:cs="OpenSymbol" w:hint="default"/>
+      </w:rPr>
+    </w:lvl>
+  </w:abstractNum>
+  <w:abstractNum w:abstractNumId="3">
+    <w:lvl w:ilvl="0">
+      <w:start w:val="1"/>
       <w:numFmt w:val="none"/>
       <w:suff w:val="nothing"/>
       <w:lvlText w:val=""/>
@@ -1770,6 +2896,9 @@
   </w:num>
   <w:num w:numId="2">
     <w:abstractNumId w:val="2"/>
+  </w:num>
+  <w:num w:numId="3">
+    <w:abstractNumId w:val="3"/>
   </w:num>
 </w:numbering>
 </file>
@@ -1815,6 +2944,13 @@
     <w:name w:val="Nummereringstegn"/>
     <w:qFormat/>
     <w:rPr/>
+  </w:style>
+  <w:style w:type="character" w:styleId="Punktopstilling">
+    <w:name w:val="Punktopstilling"/>
+    <w:qFormat/>
+    <w:rPr>
+      <w:rFonts w:ascii="OpenSymbol" w:hAnsi="OpenSymbol" w:eastAsia="OpenSymbol" w:cs="OpenSymbol"/>
+    </w:rPr>
   </w:style>
   <w:style w:type="paragraph" w:styleId="Overskrift">
     <w:name w:val="Overskrift"/>

</xml_diff>